<commit_message>
feat: expand document generation placeholders and add support for custom alimony templates
</commit_message>
<xml_diff>
--- a/Template files/إعلان خصوم.docx
+++ b/Template files/إعلان خصوم.docx
@@ -194,9 +194,10 @@
     <w:p>
       <w:pPr>
         <w:rPr>
-          <w:rFonts w:ascii="Traditional Arabic" w:hAnsi="Traditional Arabic" w:cs="Traditional Arabic"/>
-          <w:sz w:val="36"/>
-          <w:szCs w:val="36"/>
+          <w:rFonts w:ascii="Traditional Arabic" w:hAnsi="Traditional Arabic" w:cs="Traditional Arabic" w:hint="cs"/>
+          <w:sz w:val="36"/>
+          <w:szCs w:val="36"/>
+          <w:rtl/>
         </w:rPr>
       </w:pPr>
       <w:r>
@@ -214,33 +215,51 @@
           <w:sz w:val="36"/>
           <w:szCs w:val="36"/>
         </w:rPr>
-        <w:t>{SESSION_DAY}</w:t>
-      </w:r>
-      <w:r>
-        <w:rPr>
-          <w:rFonts w:ascii="Traditional Arabic" w:hAnsi="Traditional Arabic" w:cs="Traditional Arabic" w:hint="cs"/>
-          <w:sz w:val="36"/>
-          <w:szCs w:val="36"/>
-          <w:rtl/>
-        </w:rPr>
-        <w:t xml:space="preserve"> </w:t>
-      </w:r>
-      <w:r>
-        <w:rPr>
-          <w:rFonts w:ascii="Traditional Arabic" w:hAnsi="Traditional Arabic" w:cs="Traditional Arabic" w:hint="cs"/>
-          <w:sz w:val="36"/>
-          <w:szCs w:val="36"/>
-          <w:rtl/>
-        </w:rPr>
-        <w:t xml:space="preserve"> </w:t>
-      </w:r>
-      <w:r>
-        <w:rPr>
-          <w:rFonts w:ascii="Traditional Arabic" w:hAnsi="Traditional Arabic" w:cs="Traditional Arabic"/>
-          <w:sz w:val="36"/>
-          <w:szCs w:val="36"/>
-        </w:rPr>
-        <w:t>{SESSION_DATE}</w:t>
+        <w:t>{SESSION_</w:t>
+      </w:r>
+      <w:proofErr w:type="gramStart"/>
+      <w:r>
+        <w:rPr>
+          <w:rFonts w:ascii="Traditional Arabic" w:hAnsi="Traditional Arabic" w:cs="Traditional Arabic"/>
+          <w:sz w:val="36"/>
+          <w:szCs w:val="36"/>
+        </w:rPr>
+        <w:t>DAY}</w:t>
+      </w:r>
+      <w:r>
+        <w:rPr>
+          <w:rFonts w:ascii="Traditional Arabic" w:hAnsi="Traditional Arabic" w:cs="Traditional Arabic" w:hint="cs"/>
+          <w:sz w:val="36"/>
+          <w:szCs w:val="36"/>
+          <w:rtl/>
+        </w:rPr>
+        <w:t xml:space="preserve"> </w:t>
+      </w:r>
+      <w:r>
+        <w:rPr>
+          <w:rFonts w:ascii="Traditional Arabic" w:hAnsi="Traditional Arabic" w:cs="Traditional Arabic" w:hint="cs"/>
+          <w:sz w:val="36"/>
+          <w:szCs w:val="36"/>
+          <w:rtl/>
+        </w:rPr>
+        <w:t xml:space="preserve"> </w:t>
+      </w:r>
+      <w:r>
+        <w:rPr>
+          <w:rFonts w:ascii="Traditional Arabic" w:hAnsi="Traditional Arabic" w:cs="Traditional Arabic"/>
+          <w:sz w:val="36"/>
+          <w:szCs w:val="36"/>
+        </w:rPr>
+        <w:t>{</w:t>
+      </w:r>
+      <w:proofErr w:type="gramEnd"/>
+      <w:r>
+        <w:rPr>
+          <w:rFonts w:ascii="Traditional Arabic" w:hAnsi="Traditional Arabic" w:cs="Traditional Arabic"/>
+          <w:sz w:val="36"/>
+          <w:szCs w:val="36"/>
+        </w:rPr>
+        <w:t>SESSION_DATE}</w:t>
       </w:r>
       <w:r>
         <w:rPr>
@@ -353,7 +372,16 @@
           <w:szCs w:val="36"/>
           <w:rtl/>
         </w:rPr>
-        <w:t xml:space="preserve"> بخصوص دعوى</w:t>
+        <w:t xml:space="preserve"> بخصوص </w:t>
+      </w:r>
+      <w:r>
+        <w:rPr>
+          <w:rFonts w:ascii="Traditional Arabic" w:hAnsi="Traditional Arabic" w:cs="Traditional Arabic" w:hint="cs"/>
+          <w:sz w:val="36"/>
+          <w:szCs w:val="36"/>
+          <w:rtl/>
+        </w:rPr>
+        <w:t>دعوى</w:t>
       </w:r>
       <w:r>
         <w:rPr>
@@ -371,6 +399,25 @@
         </w:rPr>
         <w:t xml:space="preserve"> </w:t>
       </w:r>
+      <w:r>
+        <w:rPr>
+          <w:rFonts w:ascii="Traditional Arabic" w:hAnsi="Traditional Arabic" w:cs="Traditional Arabic"/>
+          <w:sz w:val="36"/>
+          <w:szCs w:val="36"/>
+        </w:rPr>
+        <w:t xml:space="preserve"> </w:t>
+      </w:r>
+      <w:r>
+        <w:rPr>
+          <w:rFonts w:ascii="Traditional Arabic" w:hAnsi="Traditional Arabic" w:cs="Traditional Arabic" w:hint="cs"/>
+          <w:sz w:val="36"/>
+          <w:szCs w:val="36"/>
+          <w:rtl/>
+        </w:rPr>
+        <w:t xml:space="preserve"> </w:t>
+      </w:r>
+      <w:bookmarkStart w:id="0" w:name="_GoBack"/>
+      <w:bookmarkEnd w:id="0"/>
     </w:p>
     <w:p>
       <w:pPr>
@@ -384,7 +431,7 @@
     <w:p>
       <w:pPr>
         <w:rPr>
-          <w:rFonts w:ascii="Traditional Arabic" w:hAnsi="Traditional Arabic" w:cs="Traditional Arabic" w:hint="cs"/>
+          <w:rFonts w:ascii="Traditional Arabic" w:hAnsi="Traditional Arabic" w:cs="Traditional Arabic"/>
           <w:sz w:val="36"/>
           <w:szCs w:val="36"/>
           <w:rtl/>
@@ -414,18 +461,7 @@
           <w:szCs w:val="36"/>
           <w:rtl/>
         </w:rPr>
-        <w:t xml:space="preserve">  </w:t>
-      </w:r>
-      <w:bookmarkStart w:id="0" w:name="_GoBack"/>
-      <w:bookmarkEnd w:id="0"/>
-      <w:r>
-        <w:rPr>
-          <w:rFonts w:ascii="Traditional Arabic" w:hAnsi="Traditional Arabic" w:cs="Traditional Arabic" w:hint="cs"/>
-          <w:sz w:val="36"/>
-          <w:szCs w:val="36"/>
-          <w:rtl/>
-        </w:rPr>
-        <w:t xml:space="preserve">  القاضي </w:t>
+        <w:t xml:space="preserve">    القاضي </w:t>
       </w:r>
       <w:r>
         <w:rPr>
@@ -857,6 +893,7 @@
   <w:style w:type="character" w:default="1" w:styleId="a0">
     <w:name w:val="Default Paragraph Font"/>
     <w:uiPriority w:val="1"/>
+    <w:semiHidden/>
     <w:unhideWhenUsed/>
   </w:style>
   <w:style w:type="table" w:default="1" w:styleId="a1">

</xml_diff>